<commit_message>
Made big edits to CompHardware and Linux
</commit_message>
<xml_diff>
--- a/Linux.docx
+++ b/Linux.docx
@@ -45,7 +45,15 @@
       <w:r>
         <w:rPr/>
         <w:tab/>
-        <w:t>GNU + Linux is an operating system, primarily used by developers such as myself and many corporations or businesses. This document will be covering the Linux OS primarily from a developer’s standpoint. I do aim to lightly cover some of the desktop features of Linux as well. Most institutionalized education systems only cover Linux from the point of view of a system admin (likely because Linux is most commonly used by server administrators), but as someone who uses Linux as their daily driver, I hope to give a bit of insight into what that’s like as well. Understanding the fundamentals is the most important thing though, so developer tools and desktop features are secondary.</w:t>
+        <w:t xml:space="preserve">GNU + Linux is an operating system, primarily used by developers such as myself and many corporations/businesses </w:t>
+      </w:r>
+      <w:r>
+        <w:rPr/>
+        <w:t>in the tech domain</w:t>
+      </w:r>
+      <w:r>
+        <w:rPr/>
+        <w:t>. This document will be covering the Linux OS primarily from a developer’s standpoint. I do aim to lightly cover some of the desktop features of Linux as well. Most institutionalized education systems only cover Linux from the point of view of a system admin (likely because Linux is most commonly used by server administrators), but as someone who uses Linux as their daily driver, I hope to give a bit of insight into what that’s like as well. Understanding the fundamentals is the most important thing though, so developer tools and desktop features are secondary.</w:t>
       </w:r>
     </w:p>
     <w:p>
@@ -2305,6 +2313,224 @@
         <w:rPr>
           <w:u w:val="single"/>
         </w:rPr>
+        <w:t>Tar Balls and Compression With tar/gzip:</w:t>
+      </w:r>
+    </w:p>
+    <w:p>
+      <w:pPr>
+        <w:pStyle w:val="Normal"/>
+        <w:rPr>
+          <w:u w:val="none"/>
+        </w:rPr>
+      </w:pPr>
+      <w:r>
+        <w:rPr>
+          <w:u w:val="none"/>
+        </w:rPr>
+        <w:tab/>
+        <w:t xml:space="preserve">Linux supports various archiving and compression algorithms/formats such as 7zip, zip, and gzip. Gzip is of course, the GNU zip format. It is actually used for compression, not archiving. </w:t>
+      </w:r>
+      <w:r>
+        <w:rPr>
+          <w:u w:val="none"/>
+        </w:rPr>
+        <w:t xml:space="preserve">It uses a compession algorithm created in the early days of computers known as Lempel-Ziv coding (LZ77). This format is a lossless algorithm, meaning that no data is lost when compressing or decompressing, unlike a lossless algorithm such as jpeg, for example. Typically files which are compressed using gzip should have the .gz extension for readability. You can specify the level of compression using options -1 to -9. The gunzip command will decompress a file compressed using gzip.  There is one glaring issue with gzip, which is that it can only compress one file at a time. In order to compress multiple files and output one compressed archive, we first need to create the archive using an archiving utility such as tar. The tar (tape archive) utility can create an archive of files which typically end with the .tar extension. </w:t>
+      </w:r>
+      <w:r>
+        <w:rPr>
+          <w:u w:val="none"/>
+        </w:rPr>
+        <w:t xml:space="preserve">A tar archive is called a tar ball. </w:t>
+      </w:r>
+      <w:r>
+        <w:rPr>
+          <w:u w:val="none"/>
+        </w:rPr>
+        <w:t>Often times, you’ll see tar being used with the -czvf options. The acronym that people have invented for these options is “</w:t>
+      </w:r>
+      <w:r>
+        <w:rPr>
+          <w:b/>
+          <w:bCs/>
+          <w:u w:val="none"/>
+        </w:rPr>
+        <w:t>T</w:t>
+      </w:r>
+      <w:r>
+        <w:rPr>
+          <w:u w:val="none"/>
+        </w:rPr>
+        <w:t xml:space="preserve">ar </w:t>
+      </w:r>
+      <w:r>
+        <w:rPr>
+          <w:b/>
+          <w:bCs/>
+          <w:u w:val="none"/>
+        </w:rPr>
+        <w:t>C</w:t>
+      </w:r>
+      <w:r>
+        <w:rPr>
+          <w:u w:val="none"/>
+        </w:rPr>
+        <w:t xml:space="preserve">an </w:t>
+      </w:r>
+      <w:r>
+        <w:rPr>
+          <w:b/>
+          <w:bCs/>
+          <w:u w:val="none"/>
+        </w:rPr>
+        <w:t>Z</w:t>
+      </w:r>
+      <w:r>
+        <w:rPr>
+          <w:u w:val="none"/>
+        </w:rPr>
+        <w:t xml:space="preserve">ip </w:t>
+      </w:r>
+      <w:r>
+        <w:rPr>
+          <w:b/>
+          <w:bCs/>
+          <w:u w:val="none"/>
+        </w:rPr>
+        <w:t>V</w:t>
+      </w:r>
+      <w:r>
+        <w:rPr>
+          <w:u w:val="none"/>
+        </w:rPr>
+        <w:t xml:space="preserve">ery </w:t>
+      </w:r>
+      <w:r>
+        <w:rPr>
+          <w:b/>
+          <w:bCs/>
+          <w:u w:val="none"/>
+        </w:rPr>
+        <w:t>F</w:t>
+      </w:r>
+      <w:r>
+        <w:rPr>
+          <w:u w:val="none"/>
+        </w:rPr>
+        <w:t>ast”.</w:t>
+      </w:r>
+      <w:r>
+        <w:rPr>
+          <w:b w:val="false"/>
+          <w:bCs w:val="false"/>
+          <w:u w:val="none"/>
+        </w:rPr>
+        <w:t xml:space="preserve"> To give an overview of what each does, -c </w:t>
+      </w:r>
+      <w:r>
+        <w:rPr>
+          <w:b w:val="false"/>
+          <w:bCs w:val="false"/>
+          <w:u w:val="none"/>
+        </w:rPr>
+        <w:t xml:space="preserve">creates the archive, -z zips it, -v is for verbosity, and -f is the files you’re adding. One thing that throws people off with that is that the name of the archive must come before the files that you want to add to the archive. To archive an entire directory, you can do: tar -czvf archive.tar directory/*. You may also use the –exclude option to exclude certain files from the </w:t>
+      </w:r>
+      <w:r>
+        <w:rPr>
+          <w:b w:val="false"/>
+          <w:bCs w:val="false"/>
+          <w:u w:val="none"/>
+        </w:rPr>
+        <w:t>tar ball</w:t>
+      </w:r>
+      <w:r>
+        <w:rPr>
+          <w:b w:val="false"/>
+          <w:bCs w:val="false"/>
+          <w:u w:val="none"/>
+        </w:rPr>
+        <w:t xml:space="preserve">. These two commands are often used in conjunction with each other, which is why you will tend to see files ending with the .tar.gz extension on Linux. In order to open these files, you must first decompress the </w:t>
+      </w:r>
+      <w:r>
+        <w:rPr>
+          <w:b w:val="false"/>
+          <w:bCs w:val="false"/>
+          <w:u w:val="none"/>
+        </w:rPr>
+        <w:t>tar ball</w:t>
+      </w:r>
+      <w:r>
+        <w:rPr>
+          <w:b w:val="false"/>
+          <w:bCs w:val="false"/>
+          <w:u w:val="none"/>
+        </w:rPr>
+        <w:t xml:space="preserve"> using gunzip, followed by </w:t>
+      </w:r>
+      <w:r>
+        <w:rPr>
+          <w:b w:val="false"/>
+          <w:bCs w:val="false"/>
+          <w:u w:val="none"/>
+        </w:rPr>
+        <w:t xml:space="preserve">tar -xvf. The only new option here is -x which means exctract. </w:t>
+      </w:r>
+    </w:p>
+    <w:p>
+      <w:pPr>
+        <w:pStyle w:val="Normal"/>
+        <w:rPr>
+          <w:b w:val="false"/>
+          <w:b w:val="false"/>
+          <w:bCs w:val="false"/>
+        </w:rPr>
+      </w:pPr>
+      <w:r>
+        <w:rPr>
+          <w:u w:val="none"/>
+        </w:rPr>
+      </w:r>
+    </w:p>
+    <w:p>
+      <w:pPr>
+        <w:pStyle w:val="Normal"/>
+        <w:rPr>
+          <w:u w:val="none"/>
+        </w:rPr>
+      </w:pPr>
+      <w:r>
+        <w:rPr>
+          <w:b w:val="false"/>
+          <w:bCs w:val="false"/>
+          <w:u w:val="none"/>
+        </w:rPr>
+        <w:tab/>
+        <w:t>As an aside, there exist other compression algorithms such as bzip (.bz2) which you can decompress (bunzip). Other less common algorithms include LZMA, XZ, LZ4, LZO, etc.</w:t>
+      </w:r>
+    </w:p>
+    <w:p>
+      <w:pPr>
+        <w:pStyle w:val="Normal"/>
+        <w:rPr>
+          <w:u w:val="single"/>
+        </w:rPr>
+      </w:pPr>
+      <w:r>
+        <w:rPr>
+          <w:u w:val="single"/>
+        </w:rPr>
+      </w:r>
+    </w:p>
+    <w:p>
+      <w:pPr>
+        <w:pStyle w:val="Normal"/>
+        <w:rPr>
+          <w:u w:val="single"/>
+        </w:rPr>
+      </w:pPr>
+      <w:r>
+        <w:rPr>
+          <w:u w:val="single"/>
+        </w:rPr>
         <w:t>I/O Streams:</w:t>
       </w:r>
     </w:p>
@@ -2688,6 +2914,823 @@
         <w:rPr>
           <w:u w:val="single"/>
         </w:rPr>
+        <w:t>Resource Managers (procfs):</w:t>
+      </w:r>
+    </w:p>
+    <w:p>
+      <w:pPr>
+        <w:pStyle w:val="Normal"/>
+        <w:rPr>
+          <w:u w:val="single"/>
+        </w:rPr>
+      </w:pPr>
+      <w:r>
+        <w:rPr>
+          <w:u w:val="single"/>
+        </w:rPr>
+      </w:r>
+    </w:p>
+    <w:p>
+      <w:pPr>
+        <w:pStyle w:val="Normal"/>
+        <w:rPr>
+          <w:u w:val="single"/>
+        </w:rPr>
+      </w:pPr>
+      <w:r>
+        <w:rPr>
+          <w:u w:val="single"/>
+        </w:rPr>
+        <w:t>Modify Kernel Parameters at Runtime using sysctl:</w:t>
+      </w:r>
+    </w:p>
+    <w:p>
+      <w:pPr>
+        <w:pStyle w:val="Normal"/>
+        <w:rPr>
+          <w:u w:val="single"/>
+        </w:rPr>
+      </w:pPr>
+      <w:r>
+        <w:rPr>
+          <w:u w:val="single"/>
+        </w:rPr>
+      </w:r>
+    </w:p>
+    <w:p>
+      <w:pPr>
+        <w:pStyle w:val="Normal"/>
+        <w:rPr>
+          <w:u w:val="single"/>
+        </w:rPr>
+      </w:pPr>
+      <w:r>
+        <w:rPr>
+          <w:u w:val="single"/>
+        </w:rPr>
+        <w:t>Swappiness:</w:t>
+      </w:r>
+    </w:p>
+    <w:p>
+      <w:pPr>
+        <w:pStyle w:val="Normal"/>
+        <w:rPr>
+          <w:u w:val="none"/>
+        </w:rPr>
+      </w:pPr>
+      <w:r>
+        <w:rPr>
+          <w:u w:val="none"/>
+        </w:rPr>
+        <w:tab/>
+        <w:t>You may know that modern computers are capable of allocating storage space on disk to be used as RAM if the system does not particularily have a lot of RAM. This is the opposite of RAM disks which is when you allocate space in RAM to be used as volatile (but very fast) storage space. The space that we allocate on disk to be used as RAM is called a swap partition. Here are some basic instructions on how to create a swap partition:</w:t>
+      </w:r>
+    </w:p>
+    <w:p>
+      <w:pPr>
+        <w:pStyle w:val="Normal"/>
+        <w:rPr>
+          <w:u w:val="none"/>
+        </w:rPr>
+      </w:pPr>
+      <w:r>
+        <w:rPr>
+          <w:u w:val="none"/>
+        </w:rPr>
+      </w:r>
+    </w:p>
+    <w:p>
+      <w:pPr>
+        <w:pStyle w:val="Normal"/>
+        <w:rPr>
+          <w:u w:val="none"/>
+        </w:rPr>
+      </w:pPr>
+      <w:r>
+        <w:rPr>
+          <w:u w:val="none"/>
+        </w:rPr>
+        <w:t>1. First we run sudo fallocate -l &lt;size&gt; &lt;swap_file&gt;. fallocate is a utility used to allocate disk space for a file. The -l option stands for ‘length’ as in length of the file in bytes. The final argument is the file location/name to give the file.</w:t>
+      </w:r>
+    </w:p>
+    <w:p>
+      <w:pPr>
+        <w:pStyle w:val="Normal"/>
+        <w:rPr>
+          <w:u w:val="none"/>
+        </w:rPr>
+      </w:pPr>
+      <w:r>
+        <w:rPr>
+          <w:u w:val="none"/>
+        </w:rPr>
+      </w:r>
+    </w:p>
+    <w:p>
+      <w:pPr>
+        <w:pStyle w:val="Normal"/>
+        <w:rPr>
+          <w:u w:val="none"/>
+        </w:rPr>
+      </w:pPr>
+      <w:r>
+        <w:rPr>
+          <w:u w:val="none"/>
+        </w:rPr>
+        <w:t>2. Next we modify the permissions for the swap file e.g. sudo chmod 600 &lt;swap_file&gt;</w:t>
+      </w:r>
+    </w:p>
+    <w:p>
+      <w:pPr>
+        <w:pStyle w:val="Normal"/>
+        <w:rPr>
+          <w:u w:val="none"/>
+        </w:rPr>
+      </w:pPr>
+      <w:r>
+        <w:rPr>
+          <w:u w:val="none"/>
+        </w:rPr>
+      </w:r>
+    </w:p>
+    <w:p>
+      <w:pPr>
+        <w:pStyle w:val="Normal"/>
+        <w:rPr>
+          <w:u w:val="none"/>
+        </w:rPr>
+      </w:pPr>
+      <w:r>
+        <w:rPr>
+          <w:u w:val="none"/>
+        </w:rPr>
+        <w:t>3. We must tell the kernel that the file is to be used as swap space. We do this using the mkswap command e.g. sudo mkswap &lt;swap_file&gt;</w:t>
+      </w:r>
+    </w:p>
+    <w:p>
+      <w:pPr>
+        <w:pStyle w:val="Normal"/>
+        <w:rPr>
+          <w:u w:val="none"/>
+        </w:rPr>
+      </w:pPr>
+      <w:r>
+        <w:rPr>
+          <w:u w:val="none"/>
+        </w:rPr>
+      </w:r>
+    </w:p>
+    <w:p>
+      <w:pPr>
+        <w:pStyle w:val="Normal"/>
+        <w:rPr>
+          <w:u w:val="none"/>
+        </w:rPr>
+      </w:pPr>
+      <w:r>
+        <w:rPr>
+          <w:u w:val="none"/>
+        </w:rPr>
+        <w:t>4. We must enable the swap file. This is sort of like mount for regular partitions, but for swap. We use the swapon command like so: sudo swapon &lt;swap_file&gt;</w:t>
+      </w:r>
+    </w:p>
+    <w:p>
+      <w:pPr>
+        <w:pStyle w:val="Normal"/>
+        <w:rPr>
+          <w:u w:val="none"/>
+        </w:rPr>
+      </w:pPr>
+      <w:r>
+        <w:rPr>
+          <w:u w:val="none"/>
+        </w:rPr>
+      </w:r>
+    </w:p>
+    <w:p>
+      <w:pPr>
+        <w:pStyle w:val="Normal"/>
+        <w:rPr>
+          <w:u w:val="none"/>
+        </w:rPr>
+      </w:pPr>
+      <w:r>
+        <w:rPr>
+          <w:u w:val="none"/>
+        </w:rPr>
+        <w:t xml:space="preserve">Running swapon --show will show us any swap storage on our system. </w:t>
+      </w:r>
+      <w:r>
+        <w:rPr>
+          <w:u w:val="none"/>
+        </w:rPr>
+        <w:t>Here is some more detailed information about how RAM is segmented on Linux:</w:t>
+      </w:r>
+    </w:p>
+    <w:p>
+      <w:pPr>
+        <w:pStyle w:val="Normal"/>
+        <w:rPr>
+          <w:u w:val="none"/>
+        </w:rPr>
+      </w:pPr>
+      <w:r>
+        <w:rPr>
+          <w:u w:val="none"/>
+        </w:rPr>
+      </w:r>
+    </w:p>
+    <w:p>
+      <w:pPr>
+        <w:pStyle w:val="Normal"/>
+        <w:rPr>
+          <w:u w:val="none"/>
+        </w:rPr>
+      </w:pPr>
+      <w:r>
+        <w:rPr>
+          <w:u w:val="none"/>
+        </w:rPr>
+        <w:t xml:space="preserve">- </w:t>
+      </w:r>
+      <w:r>
+        <w:rPr>
+          <w:u w:val="none"/>
+        </w:rPr>
+        <w:t xml:space="preserve">The lowest 16MB of RAM used to be used for Direct Memory Access (DMA). </w:t>
+      </w:r>
+    </w:p>
+    <w:p>
+      <w:pPr>
+        <w:pStyle w:val="Normal"/>
+        <w:rPr>
+          <w:u w:val="none"/>
+        </w:rPr>
+      </w:pPr>
+      <w:r>
+        <w:rPr>
+          <w:u w:val="none"/>
+        </w:rPr>
+        <w:t xml:space="preserve">- </w:t>
+      </w:r>
+      <w:r>
+        <w:rPr>
+          <w:u w:val="none"/>
+        </w:rPr>
+        <w:t>On 32-bit machines, there would be 32 bits used for memory addressing. 32 bits means 4 gigabytes of possible addresses, so the lower 32 bits of memory are sometimes called “below 4G”. The official name is DMA 32 as 32-bit computers could only do DMA in this zone of RAM.</w:t>
+      </w:r>
+    </w:p>
+    <w:p>
+      <w:pPr>
+        <w:pStyle w:val="Normal"/>
+        <w:rPr>
+          <w:u w:val="none"/>
+        </w:rPr>
+      </w:pPr>
+      <w:r>
+        <w:rPr>
+          <w:u w:val="none"/>
+        </w:rPr>
+        <w:t xml:space="preserve">- </w:t>
+      </w:r>
+      <w:r>
+        <w:rPr>
+          <w:u w:val="none"/>
+        </w:rPr>
+        <w:t xml:space="preserve">Once more on 32-bit machines, addresses </w:t>
+      </w:r>
+      <w:r>
+        <w:rPr>
+          <w:u w:val="none"/>
+        </w:rPr>
+        <w:t>above</w:t>
+      </w:r>
+      <w:r>
+        <w:rPr>
+          <w:u w:val="none"/>
+        </w:rPr>
+        <w:t xml:space="preserve"> 896MB were reserved for kernel space (0xC0000000 to 0xF7FFFFFF</w:t>
+      </w:r>
+      <w:r>
+        <w:rPr>
+          <w:u w:val="none"/>
+        </w:rPr>
+        <w:t>)</w:t>
+      </w:r>
+      <w:r>
+        <w:rPr>
+          <w:u w:val="none"/>
+        </w:rPr>
+        <w:t xml:space="preserve">. Anything </w:t>
+      </w:r>
+      <w:r>
+        <w:rPr>
+          <w:u w:val="none"/>
+        </w:rPr>
+        <w:t>below</w:t>
+      </w:r>
+      <w:r>
+        <w:rPr>
+          <w:u w:val="none"/>
+        </w:rPr>
+        <w:t xml:space="preserve"> was considered user space </w:t>
+      </w:r>
+      <w:r>
+        <w:rPr>
+          <w:u w:val="none"/>
+        </w:rPr>
+        <w:t>(minus the space reserved for DMA)</w:t>
+      </w:r>
+      <w:r>
+        <w:rPr>
+          <w:u w:val="none"/>
+        </w:rPr>
+        <w:t xml:space="preserve">. </w:t>
+      </w:r>
+      <w:r>
+        <w:rPr>
+          <w:u w:val="none"/>
+        </w:rPr>
+        <w:t>Addresses above kernel space are called high mem.</w:t>
+      </w:r>
+    </w:p>
+    <w:p>
+      <w:pPr>
+        <w:pStyle w:val="Normal"/>
+        <w:rPr>
+          <w:u w:val="none"/>
+        </w:rPr>
+      </w:pPr>
+      <w:r>
+        <w:rPr>
+          <w:u w:val="none"/>
+        </w:rPr>
+        <w:t xml:space="preserve">- </w:t>
+      </w:r>
+      <w:r>
+        <w:rPr>
+          <w:u w:val="none"/>
+        </w:rPr>
+        <w:t>Normal memory i.e. user memory is considered to be anything above 4G on 64-bit machines and anything between 16MB and 896MB on 32-bit machines.</w:t>
+      </w:r>
+    </w:p>
+    <w:p>
+      <w:pPr>
+        <w:pStyle w:val="Normal"/>
+        <w:rPr>
+          <w:u w:val="none"/>
+        </w:rPr>
+      </w:pPr>
+      <w:r>
+        <w:rPr>
+          <w:u w:val="none"/>
+        </w:rPr>
+      </w:r>
+    </w:p>
+    <w:p>
+      <w:pPr>
+        <w:pStyle w:val="Normal"/>
+        <w:rPr>
+          <w:u w:val="none"/>
+        </w:rPr>
+      </w:pPr>
+      <w:r>
+        <w:rPr>
+          <w:u w:val="none"/>
+        </w:rPr>
+        <w:t>Another thing to consider is that RAM (and disk partitions for that matter) are allocated in chunks called pages. The size of a page is determined by the kernel at boot time based on the architecture of the computer. Usually the page size will be 4K or 4096 bytes. You can check your page size by running getconf PAGESIZE.</w:t>
+        <w:br/>
+        <w:br/>
+      </w:r>
+      <w:r>
+        <w:rPr>
+          <w:u w:val="none"/>
+        </w:rPr>
+        <w:t xml:space="preserve">The memory zones that we looked at just a moment ago (DMA, DMA 32, Normal, and HighMem) are associated with one or more nodes. Each node corresponds to a CPU core. The kernel tries to allocate memory for a process running on a CPU core from the node that corresponds to that CPU core. This allows us to move the locations of these memory zones to different CPU cores if we wish to do so using something called Non-Uniform Memory Access </w:t>
+      </w:r>
+      <w:r>
+        <w:rPr>
+          <w:u w:val="none"/>
+        </w:rPr>
+        <w:t>(NUMA)</w:t>
+      </w:r>
+      <w:r>
+        <w:rPr>
+          <w:u w:val="none"/>
+        </w:rPr>
+        <w:t>. Typically, however, your computer will have one node called node zero. We can check which nodes are associated with which memory zones using cat /proc/buddyinfo. The output of this command is frankly quite confusing to grasp. Essentially you might end up with something like this (looking only at the DMA32 memory zone):</w:t>
+      </w:r>
+    </w:p>
+    <w:p>
+      <w:pPr>
+        <w:pStyle w:val="Normal"/>
+        <w:rPr>
+          <w:u w:val="none"/>
+        </w:rPr>
+      </w:pPr>
+      <w:r>
+        <w:rPr>
+          <w:u w:val="none"/>
+        </w:rPr>
+        <w:t>Node 0, zone</w:t>
+        <w:tab/>
+        <w:tab/>
+        <w:t>DMA32</w:t>
+        <w:tab/>
+        <w:t>6</w:t>
+        <w:tab/>
+        <w:t>4</w:t>
+        <w:tab/>
+        <w:t>6</w:t>
+        <w:tab/>
+        <w:t>5</w:t>
+        <w:tab/>
+        <w:t>5</w:t>
+        <w:tab/>
+        <w:t>5</w:t>
+        <w:tab/>
+        <w:t>9</w:t>
+        <w:tab/>
+        <w:t>8 ...</w:t>
+      </w:r>
+    </w:p>
+    <w:p>
+      <w:pPr>
+        <w:pStyle w:val="Normal"/>
+        <w:rPr>
+          <w:u w:val="none"/>
+        </w:rPr>
+      </w:pPr>
+      <w:r>
+        <w:rPr>
+          <w:u w:val="none"/>
+        </w:rPr>
+        <w:t xml:space="preserve"> </w:t>
+      </w:r>
+      <w:r>
+        <w:rPr>
+          <w:u w:val="none"/>
+        </w:rPr>
+        <w:t xml:space="preserve">Each number represents </w:t>
+      </w:r>
+      <w:r>
+        <w:rPr>
+          <w:u w:val="none"/>
+        </w:rPr>
+        <w:t>the number of memory chunks with a particular size</w:t>
+      </w:r>
+      <w:r>
+        <w:rPr>
+          <w:u w:val="none"/>
+        </w:rPr>
+        <w:t xml:space="preserve">. The positions in which the numbers are arranged correspond to a multiplier </w:t>
+      </w:r>
+      <w:r>
+        <w:rPr>
+          <w:u w:val="none"/>
+        </w:rPr>
+        <w:t>of PAGESIZE</w:t>
+      </w:r>
+      <w:r>
+        <w:rPr>
+          <w:u w:val="none"/>
+        </w:rPr>
+        <w:t xml:space="preserve"> calculated as 2^</w:t>
+      </w:r>
+      <w:r>
+        <w:rPr>
+          <w:u w:val="none"/>
+        </w:rPr>
+        <w:t>((2^</w:t>
+      </w:r>
+      <w:r>
+        <w:rPr>
+          <w:u w:val="none"/>
+        </w:rPr>
+        <w:t>position</w:t>
+      </w:r>
+      <w:r>
+        <w:rPr>
+          <w:u w:val="none"/>
+        </w:rPr>
+        <w:t>)</w:t>
+      </w:r>
+      <w:r>
+        <w:rPr>
+          <w:u w:val="none"/>
+        </w:rPr>
+        <w:t xml:space="preserve"> * </w:t>
+      </w:r>
+      <w:r>
+        <w:rPr>
+          <w:u w:val="none"/>
+        </w:rPr>
+        <w:t>PAGESIZE)</w:t>
+      </w:r>
+      <w:r>
+        <w:rPr>
+          <w:u w:val="none"/>
+        </w:rPr>
+        <w:t>. The ind</w:t>
+      </w:r>
+      <w:r>
+        <w:rPr>
+          <w:u w:val="none"/>
+        </w:rPr>
+        <w:t>ice</w:t>
+      </w:r>
+      <w:r>
+        <w:rPr>
+          <w:u w:val="none"/>
+        </w:rPr>
+        <w:t xml:space="preserve">s are little endian meaning that they increase as we go right. So for instance, </w:t>
+      </w:r>
+      <w:r>
+        <w:rPr>
+          <w:u w:val="none"/>
+        </w:rPr>
+        <w:t>the first number 6 means that there are 6 memory chunks in the DMA32 memory zone of size 2^(2^0 * PAGESIZE). The second number means that there are 4 memory chunks in the DMA memory zone of size 2^(2^1 * PAGESIZE) and so forth.</w:t>
+      </w:r>
+    </w:p>
+    <w:p>
+      <w:pPr>
+        <w:pStyle w:val="Normal"/>
+        <w:rPr>
+          <w:u w:val="single"/>
+        </w:rPr>
+      </w:pPr>
+      <w:r>
+        <w:rPr>
+          <w:u w:val="none"/>
+        </w:rPr>
+      </w:r>
+    </w:p>
+    <w:p>
+      <w:pPr>
+        <w:pStyle w:val="Normal"/>
+        <w:rPr>
+          <w:u w:val="single"/>
+        </w:rPr>
+      </w:pPr>
+      <w:r>
+        <w:rPr>
+          <w:u w:val="none"/>
+        </w:rPr>
+        <w:t>I’ve already mentioned the following concepts in my computer hardware and C notes, but it can’t hurt to repeat myself on important topics. We are able to map memory in various ways. Here is a list of each and how they work:</w:t>
+      </w:r>
+    </w:p>
+    <w:p>
+      <w:pPr>
+        <w:pStyle w:val="Normal"/>
+        <w:rPr>
+          <w:u w:val="single"/>
+        </w:rPr>
+      </w:pPr>
+      <w:r>
+        <w:rPr>
+          <w:u w:val="none"/>
+        </w:rPr>
+      </w:r>
+    </w:p>
+    <w:p>
+      <w:pPr>
+        <w:pStyle w:val="Normal"/>
+        <w:rPr>
+          <w:u w:val="single"/>
+        </w:rPr>
+      </w:pPr>
+      <w:r>
+        <w:rPr>
+          <w:u w:val="none"/>
+        </w:rPr>
+        <w:t>- File backed: These kind of memory mappings contain data that has been read from a file. It can be any type of file. Files are allocated on disk, which makes this type of backing good for swap files. If the system frees file backed memory and needs to obtain it once more, it can read from the file again. However, if the data has been altered in memory, those changes must be written to the file before the memory can be freed.</w:t>
+        <w:br/>
+        <w:br/>
+        <w:t>- Anonymous: Anonymous memory is a mapping with no file or device backing it. These pages may contain memory requested on-the-fly, or for things such as stack and heap. Because no file is behind an anonymous mapping, a special location must be reserved for the anonymous data. That place is the swap partition/swap file. Anonymous data is written to swap before the anonymous pages are freed.</w:t>
+        <w:br/>
+        <w:br/>
+        <w:t>- Device backed: As you know, block devices are treated as files on Linux. Data can be read or written from/to them. Device backed memory mappings have data from devices stored in them.</w:t>
+      </w:r>
+    </w:p>
+    <w:p>
+      <w:pPr>
+        <w:pStyle w:val="Normal"/>
+        <w:rPr>
+          <w:u w:val="single"/>
+        </w:rPr>
+      </w:pPr>
+      <w:r>
+        <w:rPr>
+          <w:u w:val="none"/>
+        </w:rPr>
+      </w:r>
+    </w:p>
+    <w:p>
+      <w:pPr>
+        <w:pStyle w:val="Normal"/>
+        <w:rPr>
+          <w:u w:val="single"/>
+        </w:rPr>
+      </w:pPr>
+      <w:r>
+        <w:rPr>
+          <w:u w:val="none"/>
+        </w:rPr>
+        <w:t>- Shared: Multiple page table entries can map the same page of RAM. Accessing a shared entry will display the same contents for any process accessing it, and likewise, writing to it will modify its contents for all consumers. This is typically used for Inter-Process Communication (IPC) e.g. POSIX pipes or B</w:t>
+      </w:r>
+      <w:r>
+        <w:rPr>
+          <w:u w:val="none"/>
+        </w:rPr>
+        <w:t>S</w:t>
+      </w:r>
+      <w:r>
+        <w:rPr>
+          <w:u w:val="none"/>
+        </w:rPr>
+        <w:t>D sockets.</w:t>
+      </w:r>
+    </w:p>
+    <w:p>
+      <w:pPr>
+        <w:pStyle w:val="Normal"/>
+        <w:rPr>
+          <w:u w:val="single"/>
+        </w:rPr>
+      </w:pPr>
+      <w:r>
+        <w:rPr>
+          <w:u w:val="none"/>
+        </w:rPr>
+      </w:r>
+    </w:p>
+    <w:p>
+      <w:pPr>
+        <w:pStyle w:val="Normal"/>
+        <w:rPr>
+          <w:u w:val="single"/>
+        </w:rPr>
+      </w:pPr>
+      <w:r>
+        <w:rPr>
+          <w:u w:val="none"/>
+        </w:rPr>
+        <w:t xml:space="preserve">- </w:t>
+      </w:r>
+      <w:r>
+        <w:rPr>
+          <w:u w:val="none"/>
+        </w:rPr>
+        <w:t>Copy on Write: Copy on Write (COW) a.k.a lazy backing is a technique where physical addresses only get backed to a virtual page when a process attempts to write to that location. Using this method, the system does not back the physical memory to virtual memory all at once, but rather waits until an access is attempted and only backs the pages which are requested one by one until the entire mapping has finished. The idea behind this is that having the MMU create the page table entries for a large section of RAM all at once is a compute-intensive task. This is how a function like malloc is implemented, so that if you attempt to allocate 500GB of memory all at once, the program will not crash, but instead wait until you actually attempts to access it.</w:t>
+      </w:r>
+    </w:p>
+    <w:p>
+      <w:pPr>
+        <w:pStyle w:val="Normal"/>
+        <w:rPr>
+          <w:u w:val="single"/>
+        </w:rPr>
+      </w:pPr>
+      <w:r>
+        <w:rPr>
+          <w:u w:val="none"/>
+        </w:rPr>
+      </w:r>
+    </w:p>
+    <w:p>
+      <w:pPr>
+        <w:pStyle w:val="Normal"/>
+        <w:rPr>
+          <w:u w:val="single"/>
+        </w:rPr>
+      </w:pPr>
+      <w:r>
+        <w:rPr>
+          <w:u w:val="none"/>
+        </w:rPr>
+        <w:t>For swappiness, only file and anonymous mappings are applicable. So I’ve rambled on about memory a lot up until now, but what actually is swappiness??? Well it’s simply a value between 0 and 100 which determines how much the system should rely on swap memory (where the higher the number, the more reliant the system is on swap). In a bit more detail, there are actually 2 values that swappiness controls. They go as follows:</w:t>
+      </w:r>
+    </w:p>
+    <w:p>
+      <w:pPr>
+        <w:pStyle w:val="Normal"/>
+        <w:rPr>
+          <w:u w:val="single"/>
+        </w:rPr>
+      </w:pPr>
+      <w:r>
+        <w:rPr>
+          <w:u w:val="none"/>
+        </w:rPr>
+        <w:t>anon_prio = swappiness; // System reliance on anonymous mappings</w:t>
+      </w:r>
+    </w:p>
+    <w:p>
+      <w:pPr>
+        <w:pStyle w:val="Normal"/>
+        <w:rPr>
+          <w:u w:val="single"/>
+        </w:rPr>
+      </w:pPr>
+      <w:r>
+        <w:rPr>
+          <w:u w:val="none"/>
+        </w:rPr>
+        <w:t>file_prio = 200 – swappiness; // System reliance on file mappings</w:t>
+      </w:r>
+    </w:p>
+    <w:p>
+      <w:pPr>
+        <w:pStyle w:val="Normal"/>
+        <w:rPr>
+          <w:u w:val="single"/>
+        </w:rPr>
+      </w:pPr>
+      <w:r>
+        <w:rPr>
+          <w:u w:val="none"/>
+        </w:rPr>
+        <w:t xml:space="preserve">If you look at this, you realize that as swappiness decreases, the priority of file backings increases, and as swappiness increases (which is also tied to anonymous mappings) file mapping priority decreases. </w:t>
+      </w:r>
+    </w:p>
+    <w:p>
+      <w:pPr>
+        <w:pStyle w:val="Normal"/>
+        <w:rPr>
+          <w:u w:val="single"/>
+        </w:rPr>
+      </w:pPr>
+      <w:r>
+        <w:rPr>
+          <w:u w:val="none"/>
+        </w:rPr>
+      </w:r>
+    </w:p>
+    <w:p>
+      <w:pPr>
+        <w:pStyle w:val="Normal"/>
+        <w:rPr>
+          <w:u w:val="single"/>
+        </w:rPr>
+      </w:pPr>
+      <w:r>
+        <w:rPr>
+          <w:u w:val="none"/>
+        </w:rPr>
+        <w:t>Another thing to consider is when the system actually decides to use swap... Each memory zone that we looked at earlier have a low water and high water mark. If you’re not familiar with the terms low water and high water, these are common computing terms which just mean a base threshold and max threshold (i.e. do not go below the low water mark, and do not exceed the high water mark). Another example of where I’ve seen these commonly used is with thread pools, where we set the low and high water mark for the number of threads in the pool (but I digress). In order to check the low and high water marks for each memory zone, we can run cat /proc/zoneinfo. This will list out a bunch of information including the number of free pages, the low and high water marks among other fields. In normal conditions, when free memory in a memory zone drops below the low water mark, the swap algorithm starts scanning memory pages looking for memory that it can reclaim, taking into account the relative values of anon_prio and file_prio. However, if Linux swappiness is set to 0, then swap occurs when the combined value of the file pages and free pages are less than the high water mark.</w:t>
+      </w:r>
+    </w:p>
+    <w:p>
+      <w:pPr>
+        <w:pStyle w:val="Normal"/>
+        <w:rPr>
+          <w:u w:val="single"/>
+        </w:rPr>
+      </w:pPr>
+      <w:r>
+        <w:rPr>
+          <w:u w:val="none"/>
+        </w:rPr>
+      </w:r>
+    </w:p>
+    <w:p>
+      <w:pPr>
+        <w:pStyle w:val="Normal"/>
+        <w:rPr>
+          <w:u w:val="single"/>
+        </w:rPr>
+      </w:pPr>
+      <w:r>
+        <w:rPr>
+          <w:u w:val="none"/>
+        </w:rPr>
+        <w:t>In order to check swappiness, run cat /proc/sys/vm/swappiness. In order to set the swappiness during runtime, we can use sysctl: sudo sysctl vm.swappiness=45. To make this a permanent change, we set the value in /etc/sysctl.conf.</w:t>
+      </w:r>
+    </w:p>
+    <w:p>
+      <w:pPr>
+        <w:pStyle w:val="Normal"/>
+        <w:rPr>
+          <w:u w:val="single"/>
+        </w:rPr>
+      </w:pPr>
+      <w:r>
+        <w:rPr>
+          <w:u w:val="single"/>
+        </w:rPr>
+      </w:r>
+    </w:p>
+    <w:p>
+      <w:pPr>
+        <w:pStyle w:val="Normal"/>
+        <w:rPr>
+          <w:u w:val="single"/>
+        </w:rPr>
+      </w:pPr>
+      <w:r>
+        <w:rPr>
+          <w:u w:val="single"/>
+        </w:rPr>
         <w:t>Listing Devices:</w:t>
       </w:r>
     </w:p>
@@ -2734,33 +3777,6 @@
     <w:p>
       <w:pPr>
         <w:pStyle w:val="Normal"/>
-        <w:rPr>
-          <w:u w:val="single"/>
-        </w:rPr>
-      </w:pPr>
-      <w:r>
-        <w:rPr>
-          <w:u w:val="single"/>
-        </w:rPr>
-        <w:t>Controlling Services With systemctl:</w:t>
-      </w:r>
-    </w:p>
-    <w:p>
-      <w:pPr>
-        <w:pStyle w:val="Normal"/>
-        <w:rPr>
-          <w:u w:val="single"/>
-        </w:rPr>
-      </w:pPr>
-      <w:r>
-        <w:rPr>
-          <w:u w:val="single"/>
-        </w:rPr>
-      </w:r>
-    </w:p>
-    <w:p>
-      <w:pPr>
-        <w:pStyle w:val="Normal"/>
         <w:rPr/>
       </w:pPr>
       <w:r>
@@ -2791,33 +3807,6 @@
           <w:u w:val="single"/>
         </w:rPr>
         <w:t>Loading Kernel Modules With modprobe:</w:t>
-      </w:r>
-    </w:p>
-    <w:p>
-      <w:pPr>
-        <w:pStyle w:val="Normal"/>
-        <w:rPr>
-          <w:u w:val="single"/>
-        </w:rPr>
-      </w:pPr>
-      <w:r>
-        <w:rPr>
-          <w:u w:val="single"/>
-        </w:rPr>
-      </w:r>
-    </w:p>
-    <w:p>
-      <w:pPr>
-        <w:pStyle w:val="Normal"/>
-        <w:rPr>
-          <w:u w:val="single"/>
-        </w:rPr>
-      </w:pPr>
-      <w:r>
-        <w:rPr>
-          <w:u w:val="single"/>
-        </w:rPr>
-        <w:t>Resource Managers (procfs):</w:t>
       </w:r>
     </w:p>
     <w:p>
@@ -2922,7 +3911,7 @@
         <w:pStyle w:val="Normal"/>
         <w:widowControl/>
         <w:suppressAutoHyphens w:val="true"/>
-        <w:overflowPunct w:val="false"/>
+        <w:overflowPunct w:val="true"/>
         <w:bidi w:val="0"/>
         <w:spacing w:lineRule="auto" w:line="259" w:before="0" w:after="160"/>
         <w:jc w:val="left"/>
@@ -3404,7 +4393,7 @@
     <w:pPr>
       <w:widowControl/>
       <w:suppressAutoHyphens w:val="true"/>
-      <w:overflowPunct w:val="false"/>
+      <w:overflowPunct w:val="true"/>
       <w:bidi w:val="0"/>
       <w:spacing w:lineRule="auto" w:line="259" w:before="0" w:after="160"/>
       <w:jc w:val="left"/>

</xml_diff>